<commit_message>
fix: add literature in report
</commit_message>
<xml_diff>
--- a/report.docx
+++ b/report.docx
@@ -7004,7 +7004,7 @@
           <wp:inline distB="114300" distT="114300" distL="114300" distR="114300">
             <wp:extent cx="5523030" cy="3856672"/>
             <wp:effectExtent b="0" l="0" r="0" t="0"/>
-            <wp:docPr id="5" name="image4.png"/>
+            <wp:docPr id="4" name="image4.png"/>
             <a:graphic>
               <a:graphicData uri="http://schemas.openxmlformats.org/drawingml/2006/picture">
                 <pic:pic>
@@ -10747,12 +10747,12 @@
           <wp:inline distB="114300" distT="114300" distL="114300" distR="114300">
             <wp:extent cx="5687378" cy="2229943"/>
             <wp:effectExtent b="0" l="0" r="0" t="0"/>
-            <wp:docPr id="2" name="image1.png"/>
+            <wp:docPr id="5" name="image2.png"/>
             <a:graphic>
               <a:graphicData uri="http://schemas.openxmlformats.org/drawingml/2006/picture">
                 <pic:pic>
                   <pic:nvPicPr>
-                    <pic:cNvPr id="0" name="image1.png"/>
+                    <pic:cNvPr id="0" name="image2.png"/>
                     <pic:cNvPicPr preferRelativeResize="0"/>
                   </pic:nvPicPr>
                   <pic:blipFill>
@@ -14600,12 +14600,12 @@
           <wp:inline distB="114300" distT="114300" distL="114300" distR="114300">
             <wp:extent cx="4934903" cy="5343525"/>
             <wp:effectExtent b="0" l="0" r="0" t="0"/>
-            <wp:docPr id="1" name="image2.png"/>
+            <wp:docPr id="2" name="image3.png"/>
             <a:graphic>
               <a:graphicData uri="http://schemas.openxmlformats.org/drawingml/2006/picture">
                 <pic:pic>
                   <pic:nvPicPr>
-                    <pic:cNvPr id="0" name="image2.png"/>
+                    <pic:cNvPr id="0" name="image3.png"/>
                     <pic:cNvPicPr preferRelativeResize="0"/>
                   </pic:nvPicPr>
                   <pic:blipFill>
@@ -21041,14 +21041,14 @@
         <w:rPr/>
         <w:drawing>
           <wp:inline distB="114300" distT="114300" distL="114300" distR="114300">
-            <wp:extent cx="6119820" cy="2755900"/>
+            <wp:extent cx="6119820" cy="3543300"/>
             <wp:effectExtent b="0" l="0" r="0" t="0"/>
-            <wp:docPr id="3" name="image3.png"/>
+            <wp:docPr id="1" name="image1.png"/>
             <a:graphic>
               <a:graphicData uri="http://schemas.openxmlformats.org/drawingml/2006/picture">
                 <pic:pic>
                   <pic:nvPicPr>
-                    <pic:cNvPr id="0" name="image3.png"/>
+                    <pic:cNvPr id="0" name="image1.png"/>
                     <pic:cNvPicPr preferRelativeResize="0"/>
                   </pic:nvPicPr>
                   <pic:blipFill>
@@ -21061,7 +21061,7 @@
                   <pic:spPr>
                     <a:xfrm>
                       <a:off x="0" y="0"/>
-                      <a:ext cx="6119820" cy="2755900"/>
+                      <a:ext cx="6119820" cy="3543300"/>
                     </a:xfrm>
                     <a:prstGeom prst="rect"/>
                     <a:ln/>
@@ -21104,7 +21104,7 @@
           <wp:inline distB="114300" distT="114300" distL="114300" distR="114300">
             <wp:extent cx="6119820" cy="3251200"/>
             <wp:effectExtent b="0" l="0" r="0" t="0"/>
-            <wp:docPr id="4" name="image5.png"/>
+            <wp:docPr id="3" name="image5.png"/>
             <a:graphic>
               <a:graphicData uri="http://schemas.openxmlformats.org/drawingml/2006/picture">
                 <pic:pic>
@@ -21477,9 +21477,32 @@
         <w:ind w:left="0" w:right="0" w:firstLine="0"/>
         <w:jc w:val="center"/>
         <w:rPr>
-          <w:rFonts w:ascii="Times New Roman" w:cs="Times New Roman" w:eastAsia="Times New Roman" w:hAnsi="Times New Roman"/>
-          <w:b w:val="0"/>
-          <w:bCs w:val="0"/>
+          <w:b w:val="1"/>
+          <w:bCs w:val="1"/>
+          <w:smallCaps w:val="1"/>
+        </w:rPr>
+      </w:pPr>
+      <w:r>
+        <w:br w:type="page"/>
+      </w:r>
+      <w:r>
+        <w:rPr>
+          <w:b w:val="1"/>
+          <w:bCs w:val="1"/>
+          <w:smallCaps w:val="1"/>
+          <w:rtl w:val="0"/>
+        </w:rPr>
+        <w:t xml:space="preserve">ЛИТЕРАТУРА</w:t>
+      </w:r>
+    </w:p>
+    <w:p>
+      <w:pPr>
+        <w:numPr>
+          <w:ilvl w:val="0"/>
+          <w:numId w:val="5"/>
+        </w:numPr>
+        <w:ind w:left="720" w:hanging="360"/>
+        <w:rPr>
           <w:i w:val="0"/>
           <w:iCs w:val="0"/>
           <w:smallCaps w:val="0"/>
@@ -21492,26 +21515,131 @@
         </w:rPr>
       </w:pPr>
       <w:r>
-        <w:br w:type="page"/>
-      </w:r>
-      <w:r>
-        <w:rPr>
-          <w:rFonts w:ascii="Times New Roman" w:cs="Times New Roman" w:eastAsia="Times New Roman" w:hAnsi="Times New Roman"/>
-          <w:b w:val="1"/>
-          <w:bCs w:val="1"/>
-          <w:i w:val="0"/>
-          <w:iCs w:val="0"/>
-          <w:smallCaps w:val="1"/>
-          <w:strike w:val="0"/>
-          <w:sz w:val="28"/>
-          <w:szCs w:val="28"/>
+        <w:rPr>
+          <w:rtl w:val="0"/>
+        </w:rPr>
+        <w:t xml:space="preserve">Github репозиторий проекта // Github. URL: </w:t>
+      </w:r>
+      <w:hyperlink r:id="rId11">
+        <w:r>
+          <w:rPr>
+            <w:color w:val="1155cc"/>
+            <w:u w:val="single"/>
+            <w:rtl w:val="0"/>
+          </w:rPr>
+          <w:t xml:space="preserve">https://github.com/moevm/nsql1h26-img</w:t>
+        </w:r>
+      </w:hyperlink>
+      <w:r>
+        <w:rPr>
+          <w:rtl w:val="0"/>
+        </w:rPr>
+      </w:r>
+    </w:p>
+    <w:p>
+      <w:pPr>
+        <w:numPr>
+          <w:ilvl w:val="0"/>
+          <w:numId w:val="5"/>
+        </w:numPr>
+        <w:ind w:left="720" w:hanging="360"/>
+        <w:rPr>
           <w:u w:val="none"/>
-          <w:shd w:fill="auto" w:val="clear"/>
-          <w:vertAlign w:val="baseline"/>
-          <w:rtl w:val="0"/>
-        </w:rPr>
-        <w:t xml:space="preserve">ПРИЛОЖЕНИЕ А</w:t>
-      </w:r>
+        </w:rPr>
+      </w:pPr>
+      <w:r>
+        <w:rPr>
+          <w:rtl w:val="0"/>
+        </w:rPr>
+        <w:t xml:space="preserve">Документация Docker и Docker-compose // Docker. URL: </w:t>
+      </w:r>
+      <w:hyperlink r:id="rId12">
+        <w:r>
+          <w:rPr>
+            <w:color w:val="1155cc"/>
+            <w:u w:val="single"/>
+            <w:rtl w:val="0"/>
+          </w:rPr>
+          <w:t xml:space="preserve">https://docs.docker.com/get-started/</w:t>
+        </w:r>
+      </w:hyperlink>
+      <w:r>
+        <w:rPr>
+          <w:rtl w:val="0"/>
+        </w:rPr>
+      </w:r>
+    </w:p>
+    <w:p>
+      <w:pPr>
+        <w:numPr>
+          <w:ilvl w:val="0"/>
+          <w:numId w:val="5"/>
+        </w:numPr>
+        <w:ind w:left="720" w:hanging="360"/>
+        <w:rPr>
+          <w:u w:val="none"/>
+        </w:rPr>
+      </w:pPr>
+      <w:r>
+        <w:rPr>
+          <w:rtl w:val="0"/>
+        </w:rPr>
+        <w:t xml:space="preserve">Документация Nginx // Nginx. URL: </w:t>
+      </w:r>
+      <w:hyperlink r:id="rId13">
+        <w:r>
+          <w:rPr>
+            <w:color w:val="1155cc"/>
+            <w:u w:val="single"/>
+            <w:rtl w:val="0"/>
+          </w:rPr>
+          <w:t xml:space="preserve">https://nginx.org/en/docs/</w:t>
+        </w:r>
+      </w:hyperlink>
+      <w:r>
+        <w:rPr>
+          <w:rtl w:val="0"/>
+        </w:rPr>
+      </w:r>
+    </w:p>
+    <w:p>
+      <w:pPr>
+        <w:numPr>
+          <w:ilvl w:val="0"/>
+          <w:numId w:val="5"/>
+        </w:numPr>
+        <w:ind w:left="720" w:hanging="360"/>
+        <w:rPr>
+          <w:u w:val="none"/>
+        </w:rPr>
+      </w:pPr>
+      <w:r>
+        <w:rPr>
+          <w:rtl w:val="0"/>
+        </w:rPr>
+        <w:t xml:space="preserve">Документация MongoDB // MongoDB. URL: </w:t>
+      </w:r>
+      <w:hyperlink r:id="rId14">
+        <w:r>
+          <w:rPr>
+            <w:color w:val="1155cc"/>
+            <w:u w:val="single"/>
+            <w:rtl w:val="0"/>
+          </w:rPr>
+          <w:t xml:space="preserve">https://www.mongodb.com/docs/</w:t>
+        </w:r>
+      </w:hyperlink>
+      <w:r>
+        <w:rPr>
+          <w:rtl w:val="0"/>
+        </w:rPr>
+      </w:r>
+    </w:p>
+    <w:p>
+      <w:pPr>
+        <w:ind w:left="720" w:firstLine="0"/>
+        <w:rPr/>
+      </w:pPr>
       <w:r>
         <w:rPr>
           <w:rtl w:val="0"/>
@@ -21541,13 +21669,101 @@
           <w:smallCaps w:val="1"/>
         </w:rPr>
       </w:pPr>
-      <w:bookmarkStart w:colFirst="0" w:colLast="0" w:name="_u7s0rzelhn6a" w:id="2"/>
-      <w:bookmarkEnd w:id="2"/>
-      <w:r>
+      <w:r>
+        <w:br w:type="page"/>
+      </w:r>
+      <w:r>
+        <w:rPr>
+          <w:rtl w:val="0"/>
+        </w:rPr>
+      </w:r>
+    </w:p>
+    <w:p>
+      <w:pPr>
+        <w:keepNext w:val="0"/>
+        <w:keepLines w:val="0"/>
+        <w:pageBreakBefore w:val="0"/>
+        <w:widowControl w:val="1"/>
+        <w:pBdr>
+          <w:top w:space="0" w:sz="0" w:val="nil"/>
+          <w:left w:space="0" w:sz="0" w:val="nil"/>
+          <w:bottom w:space="0" w:sz="0" w:val="nil"/>
+          <w:right w:space="0" w:sz="0" w:val="nil"/>
+          <w:between w:space="0" w:sz="0" w:val="nil"/>
+        </w:pBdr>
+        <w:shd w:fill="auto" w:val="clear"/>
+        <w:spacing w:after="0" w:before="0" w:line="360" w:lineRule="auto"/>
+        <w:ind w:left="0" w:right="0" w:firstLine="0"/>
+        <w:jc w:val="center"/>
+        <w:rPr>
+          <w:rFonts w:ascii="Times New Roman" w:cs="Times New Roman" w:eastAsia="Times New Roman" w:hAnsi="Times New Roman"/>
+          <w:b w:val="0"/>
+          <w:bCs w:val="0"/>
+          <w:i w:val="0"/>
+          <w:iCs w:val="0"/>
+          <w:smallCaps w:val="0"/>
+          <w:strike w:val="0"/>
+          <w:sz w:val="28"/>
+          <w:szCs w:val="28"/>
+          <w:u w:val="none"/>
+          <w:shd w:fill="auto" w:val="clear"/>
+          <w:vertAlign w:val="baseline"/>
+        </w:rPr>
+      </w:pPr>
+      <w:r>
+        <w:rPr>
+          <w:rFonts w:ascii="Times New Roman" w:cs="Times New Roman" w:eastAsia="Times New Roman" w:hAnsi="Times New Roman"/>
+          <w:b w:val="1"/>
+          <w:bCs w:val="1"/>
+          <w:i w:val="0"/>
+          <w:iCs w:val="0"/>
+          <w:smallCaps w:val="1"/>
+          <w:strike w:val="0"/>
+          <w:sz w:val="28"/>
+          <w:szCs w:val="28"/>
+          <w:u w:val="none"/>
+          <w:shd w:fill="auto" w:val="clear"/>
+          <w:vertAlign w:val="baseline"/>
+          <w:rtl w:val="0"/>
+        </w:rPr>
+        <w:t xml:space="preserve">ПРИЛОЖЕНИЕ А</w:t>
+      </w:r>
+      <w:r>
+        <w:rPr>
+          <w:rtl w:val="0"/>
+        </w:rPr>
+      </w:r>
+    </w:p>
+    <w:p>
+      <w:pPr>
+        <w:keepNext w:val="0"/>
+        <w:keepLines w:val="0"/>
+        <w:pageBreakBefore w:val="0"/>
+        <w:widowControl w:val="1"/>
+        <w:pBdr>
+          <w:top w:space="0" w:sz="0" w:val="nil"/>
+          <w:left w:space="0" w:sz="0" w:val="nil"/>
+          <w:bottom w:space="0" w:sz="0" w:val="nil"/>
+          <w:right w:space="0" w:sz="0" w:val="nil"/>
+          <w:between w:space="0" w:sz="0" w:val="nil"/>
+        </w:pBdr>
+        <w:shd w:fill="auto" w:val="clear"/>
+        <w:spacing w:after="0" w:before="0" w:line="360" w:lineRule="auto"/>
+        <w:ind w:left="0" w:right="0" w:firstLine="0"/>
+        <w:jc w:val="center"/>
         <w:rPr>
           <w:b w:val="1"/>
           <w:bCs w:val="1"/>
           <w:smallCaps w:val="1"/>
+        </w:rPr>
+      </w:pPr>
+      <w:bookmarkStart w:colFirst="0" w:colLast="0" w:name="_u7s0rzelhn6a" w:id="2"/>
+      <w:bookmarkEnd w:id="2"/>
+      <w:r>
+        <w:rPr>
+          <w:b w:val="1"/>
+          <w:bCs w:val="1"/>
+          <w:smallCaps w:val="1"/>
           <w:rtl w:val="0"/>
         </w:rPr>
         <w:t xml:space="preserve">ДОКУМЕНТАЦИЯ ПО СБОРКЕ И  РАЗВЕРТЫВАНИЮ ПРИЛОЖЕНИЯ</w:t>
@@ -21574,7 +21790,7 @@
         </w:rPr>
         <w:t xml:space="preserve">git clone </w:t>
       </w:r>
-      <w:hyperlink r:id="rId11">
+      <w:hyperlink r:id="rId15">
         <w:r>
           <w:rPr>
             <w:u w:val="single"/>
@@ -21993,8 +22209,8 @@
       </w:r>
     </w:p>
     <w:sectPr>
-      <w:headerReference r:id="rId12" w:type="default"/>
-      <w:footerReference r:id="rId13" w:type="default"/>
+      <w:headerReference r:id="rId16" w:type="default"/>
+      <w:footerReference r:id="rId17" w:type="default"/>
       <w:pgSz w:h="16838" w:w="11906" w:orient="portrait"/>
       <w:pgMar w:bottom="1134" w:top="1134" w:left="1701" w:right="567" w:header="425" w:footer="709"/>
       <w:pgNumType w:start="1"/>
@@ -22554,6 +22770,116 @@
       <w:rPr/>
     </w:lvl>
   </w:abstractNum>
+  <w:abstractNum w:abstractNumId="5">
+    <w:lvl w:ilvl="0">
+      <w:start w:val="1"/>
+      <w:numFmt w:val="decimal"/>
+      <w:lvlText w:val="%1."/>
+      <w:lvlJc w:val="left"/>
+      <w:pPr>
+        <w:ind w:left="720" w:hanging="360"/>
+      </w:pPr>
+      <w:rPr>
+        <w:u w:val="none"/>
+      </w:rPr>
+    </w:lvl>
+    <w:lvl w:ilvl="1">
+      <w:start w:val="1"/>
+      <w:numFmt w:val="lowerLetter"/>
+      <w:lvlText w:val="%2."/>
+      <w:lvlJc w:val="left"/>
+      <w:pPr>
+        <w:ind w:left="1440" w:hanging="360"/>
+      </w:pPr>
+      <w:rPr>
+        <w:u w:val="none"/>
+      </w:rPr>
+    </w:lvl>
+    <w:lvl w:ilvl="2">
+      <w:start w:val="1"/>
+      <w:numFmt w:val="lowerRoman"/>
+      <w:lvlText w:val="%3."/>
+      <w:lvlJc w:val="right"/>
+      <w:pPr>
+        <w:ind w:left="2160" w:hanging="360"/>
+      </w:pPr>
+      <w:rPr>
+        <w:u w:val="none"/>
+      </w:rPr>
+    </w:lvl>
+    <w:lvl w:ilvl="3">
+      <w:start w:val="1"/>
+      <w:numFmt w:val="decimal"/>
+      <w:lvlText w:val="%4."/>
+      <w:lvlJc w:val="left"/>
+      <w:pPr>
+        <w:ind w:left="2880" w:hanging="360"/>
+      </w:pPr>
+      <w:rPr>
+        <w:u w:val="none"/>
+      </w:rPr>
+    </w:lvl>
+    <w:lvl w:ilvl="4">
+      <w:start w:val="1"/>
+      <w:numFmt w:val="lowerLetter"/>
+      <w:lvlText w:val="%5."/>
+      <w:lvlJc w:val="left"/>
+      <w:pPr>
+        <w:ind w:left="3600" w:hanging="360"/>
+      </w:pPr>
+      <w:rPr>
+        <w:u w:val="none"/>
+      </w:rPr>
+    </w:lvl>
+    <w:lvl w:ilvl="5">
+      <w:start w:val="1"/>
+      <w:numFmt w:val="lowerRoman"/>
+      <w:lvlText w:val="%6."/>
+      <w:lvlJc w:val="right"/>
+      <w:pPr>
+        <w:ind w:left="4320" w:hanging="360"/>
+      </w:pPr>
+      <w:rPr>
+        <w:u w:val="none"/>
+      </w:rPr>
+    </w:lvl>
+    <w:lvl w:ilvl="6">
+      <w:start w:val="1"/>
+      <w:numFmt w:val="decimal"/>
+      <w:lvlText w:val="%7."/>
+      <w:lvlJc w:val="left"/>
+      <w:pPr>
+        <w:ind w:left="5040" w:hanging="360"/>
+      </w:pPr>
+      <w:rPr>
+        <w:u w:val="none"/>
+      </w:rPr>
+    </w:lvl>
+    <w:lvl w:ilvl="7">
+      <w:start w:val="1"/>
+      <w:numFmt w:val="lowerLetter"/>
+      <w:lvlText w:val="%8."/>
+      <w:lvlJc w:val="left"/>
+      <w:pPr>
+        <w:ind w:left="5760" w:hanging="360"/>
+      </w:pPr>
+      <w:rPr>
+        <w:u w:val="none"/>
+      </w:rPr>
+    </w:lvl>
+    <w:lvl w:ilvl="8">
+      <w:start w:val="1"/>
+      <w:numFmt w:val="lowerRoman"/>
+      <w:lvlText w:val="%9."/>
+      <w:lvlJc w:val="right"/>
+      <w:pPr>
+        <w:ind w:left="6480" w:hanging="360"/>
+      </w:pPr>
+      <w:rPr>
+        <w:u w:val="none"/>
+      </w:rPr>
+    </w:lvl>
+  </w:abstractNum>
   <w:num w:numId="1">
     <w:abstractNumId w:val="1"/>
   </w:num>
@@ -22565,6 +22891,9 @@
   </w:num>
   <w:num w:numId="4">
     <w:abstractNumId w:val="4"/>
+  </w:num>
+  <w:num w:numId="5">
+    <w:abstractNumId w:val="5"/>
   </w:num>
 </w:numbering>
 </file>

</xml_diff>

<commit_message>
fix: add literature in report and update content
</commit_message>
<xml_diff>
--- a/report.docx
+++ b/report.docx
@@ -5275,46 +5275,15 @@
           </w:tcPr>
           <w:p>
             <w:pPr>
-              <w:keepNext w:val="0"/>
-              <w:keepLines w:val="0"/>
-              <w:pageBreakBefore w:val="0"/>
-              <w:widowControl w:val="1"/>
-              <w:pBdr>
-                <w:top w:space="0" w:sz="0" w:val="nil"/>
-                <w:left w:space="0" w:sz="0" w:val="nil"/>
-                <w:bottom w:space="0" w:sz="0" w:val="nil"/>
-                <w:right w:space="0" w:sz="0" w:val="nil"/>
-                <w:between w:space="0" w:sz="0" w:val="nil"/>
-              </w:pBdr>
-              <w:shd w:fill="auto" w:val="clear"/>
-              <w:spacing w:after="0" w:before="0" w:line="360" w:lineRule="auto"/>
-              <w:ind w:left="0" w:right="0" w:firstLine="0"/>
+              <w:ind w:firstLine="0"/>
               <w:jc w:val="left"/>
-              <w:rPr>
-                <w:rFonts w:ascii="Times New Roman" w:cs="Times New Roman" w:eastAsia="Times New Roman" w:hAnsi="Times New Roman"/>
-                <w:b w:val="0"/>
-                <w:bCs w:val="0"/>
-                <w:i w:val="0"/>
-                <w:iCs w:val="0"/>
-                <w:smallCaps w:val="0"/>
-                <w:strike w:val="0"/>
-                <w:sz w:val="28"/>
-                <w:szCs w:val="28"/>
-                <w:u w:val="none"/>
-                <w:shd w:fill="auto" w:val="clear"/>
-                <w:vertAlign w:val="baseline"/>
-              </w:rPr>
+              <w:rPr/>
             </w:pPr>
             <w:r>
               <w:rPr>
                 <w:rtl w:val="0"/>
               </w:rPr>
-              <w:t xml:space="preserve">ПРИЛОЖЕНИЕ А. ДОКУМЕНТАЦИЯ ПО СБОРКЕ И  РАЗВЕРТЫВАНИЮ ПРИЛОЖЕНИЯ</w:t>
-            </w:r>
-            <w:r>
-              <w:rPr>
-                <w:rtl w:val="0"/>
-              </w:rPr>
+              <w:t xml:space="preserve">ЛИТЕРАТУРА</w:t>
             </w:r>
           </w:p>
         </w:tc>
@@ -5324,46 +5293,15 @@
           </w:tcPr>
           <w:p>
             <w:pPr>
-              <w:keepNext w:val="0"/>
-              <w:keepLines w:val="0"/>
-              <w:pageBreakBefore w:val="0"/>
-              <w:widowControl w:val="1"/>
-              <w:pBdr>
-                <w:top w:space="0" w:sz="0" w:val="nil"/>
-                <w:left w:space="0" w:sz="0" w:val="nil"/>
-                <w:bottom w:space="0" w:sz="0" w:val="nil"/>
-                <w:right w:space="0" w:sz="0" w:val="nil"/>
-                <w:between w:space="0" w:sz="0" w:val="nil"/>
-              </w:pBdr>
-              <w:shd w:fill="auto" w:val="clear"/>
-              <w:spacing w:after="0" w:before="0" w:line="360" w:lineRule="auto"/>
-              <w:ind w:left="0" w:right="0" w:firstLine="0"/>
+              <w:ind w:firstLine="0"/>
               <w:jc w:val="center"/>
-              <w:rPr>
-                <w:rFonts w:ascii="Times New Roman" w:cs="Times New Roman" w:eastAsia="Times New Roman" w:hAnsi="Times New Roman"/>
-                <w:b w:val="0"/>
-                <w:bCs w:val="0"/>
-                <w:i w:val="0"/>
-                <w:iCs w:val="0"/>
-                <w:smallCaps w:val="0"/>
-                <w:strike w:val="0"/>
-                <w:sz w:val="28"/>
-                <w:szCs w:val="28"/>
-                <w:u w:val="none"/>
-                <w:shd w:fill="auto" w:val="clear"/>
-                <w:vertAlign w:val="baseline"/>
-              </w:rPr>
+              <w:rPr/>
             </w:pPr>
             <w:r>
               <w:rPr>
                 <w:rtl w:val="0"/>
               </w:rPr>
               <w:t xml:space="preserve">55</w:t>
-            </w:r>
-            <w:r>
-              <w:rPr>
-                <w:rtl w:val="0"/>
-              </w:rPr>
             </w:r>
           </w:p>
         </w:tc>
@@ -5422,6 +5360,153 @@
           </w:tcPr>
           <w:p>
             <w:pPr>
+              <w:keepNext w:val="0"/>
+              <w:keepLines w:val="0"/>
+              <w:pageBreakBefore w:val="0"/>
+              <w:widowControl w:val="1"/>
+              <w:pBdr>
+                <w:top w:space="0" w:sz="0" w:val="nil"/>
+                <w:left w:space="0" w:sz="0" w:val="nil"/>
+                <w:bottom w:space="0" w:sz="0" w:val="nil"/>
+                <w:right w:space="0" w:sz="0" w:val="nil"/>
+                <w:between w:space="0" w:sz="0" w:val="nil"/>
+              </w:pBdr>
+              <w:shd w:fill="auto" w:val="clear"/>
+              <w:spacing w:after="0" w:before="0" w:line="360" w:lineRule="auto"/>
+              <w:ind w:left="0" w:right="0" w:firstLine="0"/>
+              <w:jc w:val="left"/>
+              <w:rPr>
+                <w:rFonts w:ascii="Times New Roman" w:cs="Times New Roman" w:eastAsia="Times New Roman" w:hAnsi="Times New Roman"/>
+                <w:b w:val="0"/>
+                <w:bCs w:val="0"/>
+                <w:i w:val="0"/>
+                <w:iCs w:val="0"/>
+                <w:smallCaps w:val="0"/>
+                <w:strike w:val="0"/>
+                <w:sz w:val="28"/>
+                <w:szCs w:val="28"/>
+                <w:u w:val="none"/>
+                <w:shd w:fill="auto" w:val="clear"/>
+                <w:vertAlign w:val="baseline"/>
+              </w:rPr>
+            </w:pPr>
+            <w:r>
+              <w:rPr>
+                <w:rtl w:val="0"/>
+              </w:rPr>
+              <w:t xml:space="preserve">ПРИЛОЖЕНИЕ А. ДОКУМЕНТАЦИЯ ПО СБОРКЕ И  РАЗВЕРТЫВАНИЮ ПРИЛОЖЕНИЯ</w:t>
+            </w:r>
+            <w:r>
+              <w:rPr>
+                <w:rtl w:val="0"/>
+              </w:rPr>
+            </w:r>
+          </w:p>
+        </w:tc>
+        <w:tc>
+          <w:tcPr>
+            <w:vAlign w:val="top"/>
+          </w:tcPr>
+          <w:p>
+            <w:pPr>
+              <w:keepNext w:val="0"/>
+              <w:keepLines w:val="0"/>
+              <w:pageBreakBefore w:val="0"/>
+              <w:widowControl w:val="1"/>
+              <w:pBdr>
+                <w:top w:space="0" w:sz="0" w:val="nil"/>
+                <w:left w:space="0" w:sz="0" w:val="nil"/>
+                <w:bottom w:space="0" w:sz="0" w:val="nil"/>
+                <w:right w:space="0" w:sz="0" w:val="nil"/>
+                <w:between w:space="0" w:sz="0" w:val="nil"/>
+              </w:pBdr>
+              <w:shd w:fill="auto" w:val="clear"/>
+              <w:spacing w:after="0" w:before="0" w:line="360" w:lineRule="auto"/>
+              <w:ind w:left="0" w:right="0" w:firstLine="0"/>
+              <w:jc w:val="center"/>
+              <w:rPr>
+                <w:rFonts w:ascii="Times New Roman" w:cs="Times New Roman" w:eastAsia="Times New Roman" w:hAnsi="Times New Roman"/>
+                <w:b w:val="0"/>
+                <w:bCs w:val="0"/>
+                <w:i w:val="0"/>
+                <w:iCs w:val="0"/>
+                <w:smallCaps w:val="0"/>
+                <w:strike w:val="0"/>
+                <w:sz w:val="28"/>
+                <w:szCs w:val="28"/>
+                <w:u w:val="none"/>
+                <w:shd w:fill="auto" w:val="clear"/>
+                <w:vertAlign w:val="baseline"/>
+              </w:rPr>
+            </w:pPr>
+            <w:r>
+              <w:rPr>
+                <w:rtl w:val="0"/>
+              </w:rPr>
+              <w:t xml:space="preserve">56</w:t>
+            </w:r>
+            <w:r>
+              <w:rPr>
+                <w:rtl w:val="0"/>
+              </w:rPr>
+            </w:r>
+          </w:p>
+        </w:tc>
+      </w:tr>
+      <w:tr>
+        <w:trPr>
+          <w:cantSplit w:val="0"/>
+          <w:tblHeader w:val="0"/>
+        </w:trPr>
+        <w:tc>
+          <w:tcPr>
+            <w:vAlign w:val="top"/>
+          </w:tcPr>
+          <w:p>
+            <w:pPr>
+              <w:keepNext w:val="0"/>
+              <w:keepLines w:val="0"/>
+              <w:pageBreakBefore w:val="0"/>
+              <w:widowControl w:val="1"/>
+              <w:pBdr>
+                <w:top w:space="0" w:sz="0" w:val="nil"/>
+                <w:left w:space="0" w:sz="0" w:val="nil"/>
+                <w:bottom w:space="0" w:sz="0" w:val="nil"/>
+                <w:right w:space="0" w:sz="0" w:val="nil"/>
+                <w:between w:space="0" w:sz="0" w:val="nil"/>
+              </w:pBdr>
+              <w:shd w:fill="auto" w:val="clear"/>
+              <w:spacing w:after="0" w:before="0" w:line="360" w:lineRule="auto"/>
+              <w:ind w:left="0" w:right="0" w:firstLine="0"/>
+              <w:jc w:val="center"/>
+              <w:rPr>
+                <w:rFonts w:ascii="Times New Roman" w:cs="Times New Roman" w:eastAsia="Times New Roman" w:hAnsi="Times New Roman"/>
+                <w:b w:val="0"/>
+                <w:bCs w:val="0"/>
+                <w:i w:val="0"/>
+                <w:iCs w:val="0"/>
+                <w:smallCaps w:val="0"/>
+                <w:strike w:val="0"/>
+                <w:sz w:val="28"/>
+                <w:szCs w:val="28"/>
+                <w:u w:val="none"/>
+                <w:shd w:fill="auto" w:val="clear"/>
+                <w:vertAlign w:val="baseline"/>
+              </w:rPr>
+            </w:pPr>
+            <w:r>
+              <w:rPr>
+                <w:rtl w:val="0"/>
+              </w:rPr>
+            </w:r>
+          </w:p>
+        </w:tc>
+        <w:tc>
+          <w:tcPr>
+            <w:vAlign w:val="top"/>
+          </w:tcPr>
+          <w:p>
+            <w:pPr>
               <w:ind w:firstLine="0"/>
               <w:jc w:val="left"/>
               <w:rPr/>
@@ -5487,7 +5572,7 @@
               <w:rPr>
                 <w:rtl w:val="0"/>
               </w:rPr>
-              <w:t xml:space="preserve">56</w:t>
+              <w:t xml:space="preserve">57</w:t>
             </w:r>
             <w:r>
               <w:rPr>
@@ -7004,12 +7089,12 @@
           <wp:inline distB="114300" distT="114300" distL="114300" distR="114300">
             <wp:extent cx="5523030" cy="3856672"/>
             <wp:effectExtent b="0" l="0" r="0" t="0"/>
-            <wp:docPr id="4" name="image4.png"/>
+            <wp:docPr id="4" name="image3.png"/>
             <a:graphic>
               <a:graphicData uri="http://schemas.openxmlformats.org/drawingml/2006/picture">
                 <pic:pic>
                   <pic:nvPicPr>
-                    <pic:cNvPr id="0" name="image4.png"/>
+                    <pic:cNvPr id="0" name="image3.png"/>
                     <pic:cNvPicPr preferRelativeResize="0"/>
                   </pic:nvPicPr>
                   <pic:blipFill>
@@ -10747,12 +10832,12 @@
           <wp:inline distB="114300" distT="114300" distL="114300" distR="114300">
             <wp:extent cx="5687378" cy="2229943"/>
             <wp:effectExtent b="0" l="0" r="0" t="0"/>
-            <wp:docPr id="5" name="image2.png"/>
+            <wp:docPr id="5" name="image1.png"/>
             <a:graphic>
               <a:graphicData uri="http://schemas.openxmlformats.org/drawingml/2006/picture">
                 <pic:pic>
                   <pic:nvPicPr>
-                    <pic:cNvPr id="0" name="image2.png"/>
+                    <pic:cNvPr id="0" name="image1.png"/>
                     <pic:cNvPicPr preferRelativeResize="0"/>
                   </pic:nvPicPr>
                   <pic:blipFill>
@@ -14600,12 +14685,12 @@
           <wp:inline distB="114300" distT="114300" distL="114300" distR="114300">
             <wp:extent cx="4934903" cy="5343525"/>
             <wp:effectExtent b="0" l="0" r="0" t="0"/>
-            <wp:docPr id="2" name="image3.png"/>
+            <wp:docPr id="2" name="image4.png"/>
             <a:graphic>
               <a:graphicData uri="http://schemas.openxmlformats.org/drawingml/2006/picture">
                 <pic:pic>
                   <pic:nvPicPr>
-                    <pic:cNvPr id="0" name="image3.png"/>
+                    <pic:cNvPr id="0" name="image4.png"/>
                     <pic:cNvPicPr preferRelativeResize="0"/>
                   </pic:nvPicPr>
                   <pic:blipFill>
@@ -21043,12 +21128,12 @@
           <wp:inline distB="114300" distT="114300" distL="114300" distR="114300">
             <wp:extent cx="6119820" cy="3543300"/>
             <wp:effectExtent b="0" l="0" r="0" t="0"/>
-            <wp:docPr id="1" name="image1.png"/>
+            <wp:docPr id="1" name="image2.png"/>
             <a:graphic>
               <a:graphicData uri="http://schemas.openxmlformats.org/drawingml/2006/picture">
                 <pic:pic>
                   <pic:nvPicPr>
-                    <pic:cNvPr id="0" name="image1.png"/>
+                    <pic:cNvPr id="0" name="image2.png"/>
                     <pic:cNvPicPr preferRelativeResize="0"/>
                   </pic:nvPicPr>
                   <pic:blipFill>

</xml_diff>